<commit_message>
sorted some references out in draft
</commit_message>
<xml_diff>
--- a/P2/P2 draft c2v5.docx
+++ b/P2/P2 draft c2v5.docx
@@ -6292,7 +6292,70 @@
     </w:p>
     <w:p>
       <w:r>
-        <w:t xml:space="preserve">Heart rate is derived from the PPG waveform using a peak-detection approach applied to the systolic peaks of successive pulses. The raw PPG signal is first band-pass filtered (0.5Hz–8Hz) using a zero-phase second-order Butterworth filter to remove baseline wander caused by respiration and motion while preserving the pulsatile (cardiac) component of the waveform [8]. Detecting the systolic peak of each pulse in the filtered signal is analogous to R-peak detection in an ECG signal, and is performed using the event-related moving-average algorithm of Elgendi et al. [37], which was reported to achieve a higher sensitivity and positive predictivity (99.84% and 99.89% respectively) than local-maxima, derivative-based and slope-sum-based peak detectors while remaining computationally light enough for real-time, on-device use [37]. The algorithm proceeds in three stages: pre-processing, feature extraction and thresholding.  In pre-processing, the band-pass-filtered signal is clipped to remove negative values, producing a clipped signal, z(n) (dimensionless, where n is the discrete sample index), which is then squared to emphasise the systolic wave and suppress the diastolic wave and residual noise [37]:  </w:t>
+        <w:t xml:space="preserve">Heart rate is derived from the PPG waveform using a peak-detection approach applied to the systolic peaks of successive pulses. The raw PPG signal is first band-pass filtered (0.5Hz–8Hz) using a zero-phase second-order Butterworth filter to remove baseline wander caused by respiration and motion while preserving the pulsatile (cardiac) component of the waveform [8]. Detecting the systolic peak of each pulse in the filtered signal is analogous to R-peak detection in an ECG signal, and is performed using the event-related moving-average algorithm of Elgendi et al. </w:t>
+      </w:r>
+      <w:r>
+        <w:fldChar w:fldCharType="begin"/>
+      </w:r>
+      <w:r>
+        <w:instrText xml:space="preserve"> ADDIN ZOTERO_ITEM CSL_CITATION {"citationID":"EChcYhDP","properties":{"unsorted":false,"formattedCitation":"[37]","plainCitation":"[37]","noteIndex":0},"citationItems":[{"id":328,"uris":["http://zotero.org/users/19683069/items/X49LCWCB"],"itemData":{"id":328,"type":"article-journal","container-title":"PLoS ONE","DOI":"10.1371/journal.pone.0076585","ISSN":"1932-6203","issue":"10","journalAbbreviation":"PLoS ONE","language":"en","page":"e76585","source":"DOI.org (Crossref)","title":"Systolic Peak Detection in Acceleration Photoplethysmograms Measured from Emergency Responders in Tropical Conditions","volume":"8","author":[{"family":"Elgendi","given":"Mohamed"},{"family":"Norton","given":"Ian"},{"family":"Brearley","given":"Matt"},{"family":"Abbott","given":"Derek"},{"family":"Schuurmans","given":"Dale"}],"editor":[{"family":"Bondarenko","given":"Vladimir E."}],"issued":{"date-parts":[["2013",10,22]]}}}],"schema":"https://github.com/citation-style-language/schema/raw/master/csl-citation.json"} </w:instrText>
+      </w:r>
+      <w:r>
+        <w:fldChar w:fldCharType="separate"/>
+      </w:r>
+      <w:r>
+        <w:rPr>
+          <w:rFonts w:ascii="Aptos" w:hAnsi="Aptos"/>
+        </w:rPr>
+        <w:t>[37]</w:t>
+      </w:r>
+      <w:r>
+        <w:fldChar w:fldCharType="end"/>
+      </w:r>
+      <w:r>
+        <w:t xml:space="preserve">, which was reported to achieve a higher sensitivity and positive predictivity (99.84% and 99.89% respectively) than local-maxima, derivative-based and slope-sum-based peak detectors while remaining computationally light enough for real-time, on-device use </w:t>
+      </w:r>
+      <w:r>
+        <w:fldChar w:fldCharType="begin"/>
+      </w:r>
+      <w:r>
+        <w:instrText xml:space="preserve"> ADDIN ZOTERO_ITEM CSL_CITATION {"citationID":"vg7NdcnX","properties":{"unsorted":false,"formattedCitation":"[37]","plainCitation":"[37]","noteIndex":0},"citationItems":[{"id":328,"uris":["http://zotero.org/users/19683069/items/X49LCWCB"],"itemData":{"id":328,"type":"article-journal","container-title":"PLoS ONE","DOI":"10.1371/journal.pone.0076585","ISSN":"1932-6203","issue":"10","journalAbbreviation":"PLoS ONE","language":"en","page":"e76585","source":"DOI.org (Crossref)","title":"Systolic Peak Detection in Acceleration Photoplethysmograms Measured from Emergency Responders in Tropical Conditions","volume":"8","author":[{"family":"Elgendi","given":"Mohamed"},{"family":"Norton","given":"Ian"},{"family":"Brearley","given":"Matt"},{"family":"Abbott","given":"Derek"},{"family":"Schuurmans","given":"Dale"}],"editor":[{"family":"Bondarenko","given":"Vladimir E."}],"issued":{"date-parts":[["2013",10,22]]}}}],"schema":"https://github.com/citation-style-language/schema/raw/master/csl-citation.json"} </w:instrText>
+      </w:r>
+      <w:r>
+        <w:fldChar w:fldCharType="separate"/>
+      </w:r>
+      <w:r>
+        <w:rPr>
+          <w:rFonts w:ascii="Aptos" w:hAnsi="Aptos"/>
+        </w:rPr>
+        <w:t>[37]</w:t>
+      </w:r>
+      <w:r>
+        <w:fldChar w:fldCharType="end"/>
+      </w:r>
+      <w:r>
+        <w:t xml:space="preserve">. The algorithm proceeds in three stages: pre-processing, feature extraction and thresholding.  In pre-processing, the band-pass-filtered signal is clipped to remove negative values, producing a clipped signal, z(n) (dimensionless, where n is the discrete sample index), which is then squared to emphasise the systolic wave and suppress the diastolic wave and residual noise </w:t>
+      </w:r>
+      <w:r>
+        <w:fldChar w:fldCharType="begin"/>
+      </w:r>
+      <w:r>
+        <w:instrText xml:space="preserve"> ADDIN ZOTERO_ITEM CSL_CITATION {"citationID":"VM2kfnq9","properties":{"unsorted":false,"formattedCitation":"[37]","plainCitation":"[37]","noteIndex":0},"citationItems":[{"id":328,"uris":["http://zotero.org/users/19683069/items/X49LCWCB"],"itemData":{"id":328,"type":"article-journal","container-title":"PLoS ONE","DOI":"10.1371/journal.pone.0076585","ISSN":"1932-6203","issue":"10","journalAbbreviation":"PLoS ONE","language":"en","page":"e76585","source":"DOI.org (Crossref)","title":"Systolic Peak Detection in Acceleration Photoplethysmograms Measured from Emergency Responders in Tropical Conditions","volume":"8","author":[{"family":"Elgendi","given":"Mohamed"},{"family":"Norton","given":"Ian"},{"family":"Brearley","given":"Matt"},{"family":"Abbott","given":"Derek"},{"family":"Schuurmans","given":"Dale"}],"editor":[{"family":"Bondarenko","given":"Vladimir E."}],"issued":{"date-parts":[["2013",10,22]]}}}],"schema":"https://github.com/citation-style-language/schema/raw/master/csl-citation.json"} </w:instrText>
+      </w:r>
+      <w:r>
+        <w:fldChar w:fldCharType="separate"/>
+      </w:r>
+      <w:r>
+        <w:rPr>
+          <w:rFonts w:ascii="Aptos" w:hAnsi="Aptos"/>
+        </w:rPr>
+        <w:t>[37]</w:t>
+      </w:r>
+      <w:r>
+        <w:fldChar w:fldCharType="end"/>
+      </w:r>
+      <w:r>
+        <w:t xml:space="preserve">:  </w:t>
       </w:r>
       <w:r>
         <w:rPr>
@@ -6301,7 +6364,28 @@
         <w:t>y(n) = [z(n)]²</w:t>
       </w:r>
       <w:r>
-        <w:t xml:space="preserve">  where y(n) (dimensionless) is the squared, clipped signal at sample n.  In feature extraction, two moving averages of y(n) are computed to identify candidate “blocks of interest” likely to contain a systolic peak [37]. The first, MA_peak(n), uses a short window matched to the expected duration of a systolic peak:  </w:t>
+        <w:t xml:space="preserve">  where y(n) (dimensionless) is the squared, clipped signal at sample n.  In feature extraction, two moving averages of y(n) are computed to identify candidate “blocks of interest” likely to contain a systolic peak </w:t>
+      </w:r>
+      <w:r>
+        <w:fldChar w:fldCharType="begin"/>
+      </w:r>
+      <w:r>
+        <w:instrText xml:space="preserve"> ADDIN ZOTERO_ITEM CSL_CITATION {"citationID":"QuJRPnGg","properties":{"unsorted":false,"formattedCitation":"[37]","plainCitation":"[37]","noteIndex":0},"citationItems":[{"id":328,"uris":["http://zotero.org/users/19683069/items/X49LCWCB"],"itemData":{"id":328,"type":"article-journal","container-title":"PLoS ONE","DOI":"10.1371/journal.pone.0076585","ISSN":"1932-6203","issue":"10","journalAbbreviation":"PLoS ONE","language":"en","page":"e76585","source":"DOI.org (Crossref)","title":"Systolic Peak Detection in Acceleration Photoplethysmograms Measured from Emergency Responders in Tropical Conditions","volume":"8","author":[{"family":"Elgendi","given":"Mohamed"},{"family":"Norton","given":"Ian"},{"family":"Brearley","given":"Matt"},{"family":"Abbott","given":"Derek"},{"family":"Schuurmans","given":"Dale"}],"editor":[{"family":"Bondarenko","given":"Vladimir E."}],"issued":{"date-parts":[["2013",10,22]]}}}],"schema":"https://github.com/citation-style-language/schema/raw/master/csl-citation.json"} </w:instrText>
+      </w:r>
+      <w:r>
+        <w:fldChar w:fldCharType="separate"/>
+      </w:r>
+      <w:r>
+        <w:rPr>
+          <w:rFonts w:ascii="Aptos" w:hAnsi="Aptos"/>
+        </w:rPr>
+        <w:t>[37]</w:t>
+      </w:r>
+      <w:r>
+        <w:fldChar w:fldCharType="end"/>
+      </w:r>
+      <w:r>
+        <w:t xml:space="preserve">. The first, MA_peak(n), uses a short window matched to the expected duration of a systolic peak:  </w:t>
       </w:r>
       <w:r>
         <w:rPr>
@@ -6319,7 +6403,49 @@
         <w:t>W1 = round(0.111 × fs)</w:t>
       </w:r>
       <w:r>
-        <w:t xml:space="preserve">, rounded to the nearest odd integer [37]. The second, MA_beat(n), uses a wider window matched to the expected duration of one full heartbeat, computed in the same way as MA_peak(n) but with a window, W2 (samples), corresponding to 667ms [37].  In thresholding, a dynamic threshold, THR1(n) (dimensionless, same units as y(n)), is formed by adding an offset to MA_beat(n):  </w:t>
+        <w:t xml:space="preserve">, rounded to the nearest odd integer </w:t>
+      </w:r>
+      <w:r>
+        <w:fldChar w:fldCharType="begin"/>
+      </w:r>
+      <w:r>
+        <w:instrText xml:space="preserve"> ADDIN ZOTERO_ITEM CSL_CITATION {"citationID":"2v308g4v","properties":{"unsorted":false,"formattedCitation":"[37]","plainCitation":"[37]","noteIndex":0},"citationItems":[{"id":328,"uris":["http://zotero.org/users/19683069/items/X49LCWCB"],"itemData":{"id":328,"type":"article-journal","container-title":"PLoS ONE","DOI":"10.1371/journal.pone.0076585","ISSN":"1932-6203","issue":"10","journalAbbreviation":"PLoS ONE","language":"en","page":"e76585","source":"DOI.org (Crossref)","title":"Systolic Peak Detection in Acceleration Photoplethysmograms Measured from Emergency Responders in Tropical Conditions","volume":"8","author":[{"family":"Elgendi","given":"Mohamed"},{"family":"Norton","given":"Ian"},{"family":"Brearley","given":"Matt"},{"family":"Abbott","given":"Derek"},{"family":"Schuurmans","given":"Dale"}],"editor":[{"family":"Bondarenko","given":"Vladimir E."}],"issued":{"date-parts":[["2013",10,22]]}}}],"schema":"https://github.com/citation-style-language/schema/raw/master/csl-citation.json"} </w:instrText>
+      </w:r>
+      <w:r>
+        <w:fldChar w:fldCharType="separate"/>
+      </w:r>
+      <w:r>
+        <w:rPr>
+          <w:rFonts w:ascii="Aptos" w:hAnsi="Aptos"/>
+        </w:rPr>
+        <w:t>[37]</w:t>
+      </w:r>
+      <w:r>
+        <w:fldChar w:fldCharType="end"/>
+      </w:r>
+      <w:r>
+        <w:t xml:space="preserve">. The second, MA_beat(n), uses a wider window matched to the expected duration of one full heartbeat, computed in the same way as MA_peak(n) but with a window, W2 (samples), corresponding to 667ms </w:t>
+      </w:r>
+      <w:r>
+        <w:fldChar w:fldCharType="begin"/>
+      </w:r>
+      <w:r>
+        <w:instrText xml:space="preserve"> ADDIN ZOTERO_ITEM CSL_CITATION {"citationID":"9vX6P1zO","properties":{"unsorted":false,"formattedCitation":"[37]","plainCitation":"[37]","noteIndex":0},"citationItems":[{"id":328,"uris":["http://zotero.org/users/19683069/items/X49LCWCB"],"itemData":{"id":328,"type":"article-journal","container-title":"PLoS ONE","DOI":"10.1371/journal.pone.0076585","ISSN":"1932-6203","issue":"10","journalAbbreviation":"PLoS ONE","language":"en","page":"e76585","source":"DOI.org (Crossref)","title":"Systolic Peak Detection in Acceleration Photoplethysmograms Measured from Emergency Responders in Tropical Conditions","volume":"8","author":[{"family":"Elgendi","given":"Mohamed"},{"family":"Norton","given":"Ian"},{"family":"Brearley","given":"Matt"},{"family":"Abbott","given":"Derek"},{"family":"Schuurmans","given":"Dale"}],"editor":[{"family":"Bondarenko","given":"Vladimir E."}],"issued":{"date-parts":[["2013",10,22]]}}}],"schema":"https://github.com/citation-style-language/schema/raw/master/csl-citation.json"} </w:instrText>
+      </w:r>
+      <w:r>
+        <w:fldChar w:fldCharType="separate"/>
+      </w:r>
+      <w:r>
+        <w:rPr>
+          <w:rFonts w:ascii="Aptos" w:hAnsi="Aptos"/>
+        </w:rPr>
+        <w:t>[37]</w:t>
+      </w:r>
+      <w:r>
+        <w:fldChar w:fldCharType="end"/>
+      </w:r>
+      <w:r>
+        <w:t xml:space="preserve">.  In thresholding, a dynamic threshold, THR1(n) (dimensionless, same units as y(n)), is formed by adding an offset to MA_beat(n):  </w:t>
       </w:r>
       <w:r>
         <w:rPr>
@@ -6337,11 +6463,74 @@
         <w:t>β = α × y_mean, α = 0.02</w:t>
       </w:r>
       <w:r>
-        <w:t xml:space="preserve"> is an empirically optimised offset coefficient and y_mean (dimensionless) is the mean value of y(n) over the current analysis window [37]. A block of interest is any contiguous run of samples for which MA_peak(n) ≥ THR1(n); blocks narrower than W1 samples are rejected as noise, since a genuine systolic peak is expected to occupy at least the systolic-peak duration, while blocks meeting or exceeding this width are accepted as containing a systolic peak [37]. Within each </w:t>
+        <w:t xml:space="preserve"> is an empirically optimised offset coefficient and y_mean (dimensionless) is the mean value of y(n) over the current analysis window </w:t>
+      </w:r>
+      <w:r>
+        <w:fldChar w:fldCharType="begin"/>
+      </w:r>
+      <w:r>
+        <w:instrText xml:space="preserve"> ADDIN ZOTERO_ITEM CSL_CITATION {"citationID":"9Tqkfc2i","properties":{"unsorted":false,"formattedCitation":"[37]","plainCitation":"[37]","noteIndex":0},"citationItems":[{"id":328,"uris":["http://zotero.org/users/19683069/items/X49LCWCB"],"itemData":{"id":328,"type":"article-journal","container-title":"PLoS ONE","DOI":"10.1371/journal.pone.0076585","ISSN":"1932-6203","issue":"10","journalAbbreviation":"PLoS ONE","language":"en","page":"e76585","source":"DOI.org (Crossref)","title":"Systolic Peak Detection in Acceleration Photoplethysmograms Measured from Emergency Responders in Tropical Conditions","volume":"8","author":[{"family":"Elgendi","given":"Mohamed"},{"family":"Norton","given":"Ian"},{"family":"Brearley","given":"Matt"},{"family":"Abbott","given":"Derek"},{"family":"Schuurmans","given":"Dale"}],"editor":[{"family":"Bondarenko","given":"Vladimir E."}],"issued":{"date-parts":[["2013",10,22]]}}}],"schema":"https://github.com/citation-style-language/schema/raw/master/csl-citation.json"} </w:instrText>
+      </w:r>
+      <w:r>
+        <w:fldChar w:fldCharType="separate"/>
+      </w:r>
+      <w:r>
+        <w:rPr>
+          <w:rFonts w:ascii="Aptos" w:hAnsi="Aptos"/>
+        </w:rPr>
+        <w:t>[37]</w:t>
+      </w:r>
+      <w:r>
+        <w:fldChar w:fldCharType="end"/>
+      </w:r>
+      <w:r>
+        <w:t xml:space="preserve">. A block of interest is any contiguous run of samples for which MA_peak(n) ≥ THR1(n); blocks narrower than W1 samples are rejected as noise, since a genuine systolic peak is expected to occupy at least the systolic-peak duration, while blocks meeting or exceeding this width are accepted as containing a systolic peak </w:t>
+      </w:r>
+      <w:r>
+        <w:fldChar w:fldCharType="begin"/>
+      </w:r>
+      <w:r>
+        <w:instrText xml:space="preserve"> ADDIN ZOTERO_ITEM CSL_CITATION {"citationID":"fCFHHeVO","properties":{"unsorted":false,"formattedCitation":"[37]","plainCitation":"[37]","noteIndex":0},"citationItems":[{"id":328,"uris":["http://zotero.org/users/19683069/items/X49LCWCB"],"itemData":{"id":328,"type":"article-journal","container-title":"PLoS ONE","DOI":"10.1371/journal.pone.0076585","ISSN":"1932-6203","issue":"10","journalAbbreviation":"PLoS ONE","language":"en","page":"e76585","source":"DOI.org (Crossref)","title":"Systolic Peak Detection in Acceleration Photoplethysmograms Measured from Emergency Responders in Tropical Conditions","volume":"8","author":[{"family":"Elgendi","given":"Mohamed"},{"family":"Norton","given":"Ian"},{"family":"Brearley","given":"Matt"},{"family":"Abbott","given":"Derek"},{"family":"Schuurmans","given":"Dale"}],"editor":[{"family":"Bondarenko","given":"Vladimir E."}],"issued":{"date-parts":[["2013",10,22]]}}}],"schema":"https://github.com/citation-style-language/schema/raw/master/csl-citation.json"} </w:instrText>
+      </w:r>
+      <w:r>
+        <w:fldChar w:fldCharType="separate"/>
+      </w:r>
+      <w:r>
+        <w:rPr>
+          <w:rFonts w:ascii="Aptos" w:hAnsi="Aptos"/>
+        </w:rPr>
+        <w:t>[37]</w:t>
+      </w:r>
+      <w:r>
+        <w:fldChar w:fldCharType="end"/>
+      </w:r>
+      <w:r>
+        <w:t xml:space="preserve">. Within each </w:t>
       </w:r>
       <w:r>
         <w:lastRenderedPageBreak/>
-        <w:t xml:space="preserve">accepted block, the systolic peak location is taken as the sample at which y(n) attains its maximum value [37].  The time between two consecutive accepted systolic peaks is the pulse-to-pulse interval (PPI), measured in milliseconds (ms), and is the PPG-derived equivalent of the RR interval. Intervals corresponding to a physiologically implausible instantaneous heart rate (below 40bpm or above 180bpm, consistent with the danger thresholds established in the Literature Review) are rejected as likely motion-artefact detections rather than genuine pulses [33]. Instantaneous heart rate, HR (measured in beats per minute, bpm), is then computed from each accepted pulse-to-pulse interval as:  </w:t>
+        <w:t xml:space="preserve">accepted block, the systolic peak location is taken as the sample at which y(n) attains its maximum value </w:t>
+      </w:r>
+      <w:r>
+        <w:fldChar w:fldCharType="begin"/>
+      </w:r>
+      <w:r>
+        <w:instrText xml:space="preserve"> ADDIN ZOTERO_ITEM CSL_CITATION {"citationID":"M8WgI11t","properties":{"unsorted":false,"formattedCitation":"[37]","plainCitation":"[37]","noteIndex":0},"citationItems":[{"id":328,"uris":["http://zotero.org/users/19683069/items/X49LCWCB"],"itemData":{"id":328,"type":"article-journal","container-title":"PLoS ONE","DOI":"10.1371/journal.pone.0076585","ISSN":"1932-6203","issue":"10","journalAbbreviation":"PLoS ONE","language":"en","page":"e76585","source":"DOI.org (Crossref)","title":"Systolic Peak Detection in Acceleration Photoplethysmograms Measured from Emergency Responders in Tropical Conditions","volume":"8","author":[{"family":"Elgendi","given":"Mohamed"},{"family":"Norton","given":"Ian"},{"family":"Brearley","given":"Matt"},{"family":"Abbott","given":"Derek"},{"family":"Schuurmans","given":"Dale"}],"editor":[{"family":"Bondarenko","given":"Vladimir E."}],"issued":{"date-parts":[["2013",10,22]]}}}],"schema":"https://github.com/citation-style-language/schema/raw/master/csl-citation.json"} </w:instrText>
+      </w:r>
+      <w:r>
+        <w:fldChar w:fldCharType="separate"/>
+      </w:r>
+      <w:r>
+        <w:rPr>
+          <w:rFonts w:ascii="Aptos" w:hAnsi="Aptos"/>
+        </w:rPr>
+        <w:t>[37]</w:t>
+      </w:r>
+      <w:r>
+        <w:fldChar w:fldCharType="end"/>
+      </w:r>
+      <w:r>
+        <w:t xml:space="preserve">.  The time between two consecutive accepted systolic peaks is the pulse-to-pulse interval (PPI), measured in milliseconds (ms), and is the PPG-derived equivalent of the RR interval. Intervals corresponding to a physiologically implausible instantaneous heart rate (below 40bpm or above 180bpm, consistent with the danger thresholds established in the Literature Review) are rejected as likely motion-artefact detections rather than genuine pulses [33]. Instantaneous heart rate, HR (measured in beats per minute, bpm), is then computed from each accepted pulse-to-pulse interval as:  </w:t>
       </w:r>
       <w:r>
         <w:rPr>
@@ -6355,7 +6544,28 @@
     </w:p>
     <w:p>
       <w:r>
-        <w:t xml:space="preserve">Respiratory rate is extracted from the same PPG waveform used for heart rate, without requiring a separate sensor. Breathing modulates the PPG signal in three known ways: it changes the baseline/DC level of the waveform (respiratory-induced intensity variation), it changes the amplitude of each pulse (respiratory-induced amplitude variation), and it changes the timing between pulses through respiratory sinus arrhythmia (respiratory-induced frequency variation). This project extracts the respiratory-induced intensity variation by low-pass filtering the raw PPG signal to isolate the frequency band in which normal human breathing occurs (approximately 0.1Hz to 0.5Hz, corresponding to 6 to 30 breaths per minute). Peaks in this filtered respiratory waveform are then detected using the same event-related moving-average peak-detection algorithm used for PPG systolic peaks [37], and the time between consecutive respiratory peaks gives the breath-to-breath interval, T (measured in seconds, s). Respiratory rate, RR (measured in breaths per minute), is then:  </w:t>
+        <w:t xml:space="preserve">Respiratory rate is extracted from the same PPG waveform used for heart rate, without requiring a separate sensor. Breathing modulates the PPG signal in three known ways: it changes the baseline/DC level of the waveform (respiratory-induced intensity variation), it changes the amplitude of each pulse (respiratory-induced amplitude variation), and it changes the timing between pulses through respiratory sinus arrhythmia (respiratory-induced frequency variation). This project extracts the respiratory-induced intensity variation by low-pass filtering the raw PPG signal to isolate the frequency band in which normal human breathing occurs (approximately 0.1Hz to 0.5Hz, corresponding to 6 to 30 breaths per minute). Peaks in this filtered respiratory waveform are then detected using the same event-related moving-average peak-detection algorithm used for PPG systolic peaks </w:t>
+      </w:r>
+      <w:r>
+        <w:fldChar w:fldCharType="begin"/>
+      </w:r>
+      <w:r>
+        <w:instrText xml:space="preserve"> ADDIN ZOTERO_ITEM CSL_CITATION {"citationID":"SxvRv7GE","properties":{"unsorted":false,"formattedCitation":"[37]","plainCitation":"[37]","noteIndex":0},"citationItems":[{"id":328,"uris":["http://zotero.org/users/19683069/items/X49LCWCB"],"itemData":{"id":328,"type":"article-journal","container-title":"PLoS ONE","DOI":"10.1371/journal.pone.0076585","ISSN":"1932-6203","issue":"10","journalAbbreviation":"PLoS ONE","language":"en","page":"e76585","source":"DOI.org (Crossref)","title":"Systolic Peak Detection in Acceleration Photoplethysmograms Measured from Emergency Responders in Tropical Conditions","volume":"8","author":[{"family":"Elgendi","given":"Mohamed"},{"family":"Norton","given":"Ian"},{"family":"Brearley","given":"Matt"},{"family":"Abbott","given":"Derek"},{"family":"Schuurmans","given":"Dale"}],"editor":[{"family":"Bondarenko","given":"Vladimir E."}],"issued":{"date-parts":[["2013",10,22]]}}}],"schema":"https://github.com/citation-style-language/schema/raw/master/csl-citation.json"} </w:instrText>
+      </w:r>
+      <w:r>
+        <w:fldChar w:fldCharType="separate"/>
+      </w:r>
+      <w:r>
+        <w:rPr>
+          <w:rFonts w:ascii="Aptos" w:hAnsi="Aptos"/>
+        </w:rPr>
+        <w:t>[37]</w:t>
+      </w:r>
+      <w:r>
+        <w:fldChar w:fldCharType="end"/>
+      </w:r>
+      <w:r>
+        <w:t xml:space="preserve">, and the time between consecutive respiratory peaks gives the breath-to-breath interval, T (measured in seconds, s). Respiratory rate, RR (measured in breaths per minute), is then:  </w:t>
       </w:r>
       <w:r>
         <w:rPr>
@@ -6548,11 +6758,38 @@
     </w:p>
     <w:p>
       <w:r>
-        <w:t xml:space="preserve">Rather than deriving further equations for each of the parameters above, two signal processing choices most strongly affect the accuracy of every downstream metric produced by this layer (heart rate, respiratory rate and every HRV parameter): the PPG sampling frequency and the analysis window size, both of which must be balanced against the hardware and computational-overhead constraints established earlier in this report.  Sampling frequency, fs (measured in samples per second, sps), sets the timing resolution with which pulse peaks, and therefore pulse-to-pulse intervals, can be located. Too low an fs introduces quantisation error into every PPI measurement, which propagates directly into the heart rate and every time-domain HRV parameter calculated from it; RMSSD in particular is highly sensitive to small interval-timing errors since it is computed from successive differences [33]. The PPG sensor used in this project is configured to sample at 100sps, a rate commonly used in wearable PPG heart-rate applications that provides sufficient timing resolution for reliable PPI measurement without the additional power draw of a substantially higher sampling rate [38].  Window size determines how many pulses are available for each reported metric, and different metric types require different minimum windows. Heart rate itself, and most time-domain HRV parameters, can be reliably estimated from windows of about 10s [20]. Frequency-domain parameters, particularly LF power, need enough samples to capture several full oscillation cycles at low frequency and are only reliably estimated using windows of roughly 50s or longer [20]; using a shorter window for these parameters risks spectral leakage and an unstable LF/HF ratio. This window requirement consumes part of the 60s alert-latency budget established in the Requirements and specifications section, leaving the remaining time for classification and alert dispatch. To keep pace with continuous monitoring, the analysis window is advanced using a sliding, overlapping update (rather than being recomputed from scratch after every full window), so that metrics are refreshed more often than the window length itself. Windows containing motion-artefact-corrupted or missing samples are handled by rejecting the affected pulses at the peak-detection stage, since </w:t>
+        <w:t xml:space="preserve">Rather than deriving further equations for each of the parameters above, two signal processing choices most strongly affect the accuracy of every downstream metric produced by this layer (heart rate, respiratory rate and every HRV parameter): the PPG sampling frequency and the analysis window size, both of which must be balanced against the hardware and computational-overhead constraints established earlier in this report.  Sampling frequency, fs (measured in samples per second, sps), sets the timing resolution with which pulse peaks, and therefore pulse-to-pulse intervals, can be located. Too low an fs introduces quantisation error into every PPI measurement, which propagates directly into the heart rate and every time-domain HRV parameter calculated from it; RMSSD in particular is highly sensitive to small interval-timing errors since it is computed from successive differences [33]. </w:t>
+      </w:r>
+      <w:r>
+        <w:t>This project will</w:t>
+      </w:r>
+      <w:r>
+        <w:t xml:space="preserve"> sample at 100sps, a rate commonly used in wearable PPG heart-rate applications that provides sufficient timing resolution for reliable PPI measurement without the additional power draw of a substantially higher sampling rate </w:t>
+      </w:r>
+      <w:r>
+        <w:fldChar w:fldCharType="begin"/>
+      </w:r>
+      <w:r>
+        <w:instrText xml:space="preserve"> ADDIN ZOTERO_ITEM CSL_CITATION {"citationID":"PnQioQH7","properties":{"unsorted":false,"formattedCitation":"[38]","plainCitation":"[38]","noteIndex":0},"citationItems":[{"id":332,"uris":["http://zotero.org/users/19683069/items/UHD56H73"],"itemData":{"id":332,"type":"article-journal","container-title":"Biomedical Signal Processing and Control","DOI":"10.1016/j.bspc.2021.102589","ISSN":"17468094","journalAbbreviation":"Biomedical Signal Processing and Control","language":"en","page":"102589","source":"DOI.org (Crossref)","title":"The minimal sampling frequency of the photoplethysmogram for accurate pulse rate variability parameters in healthy volunteers","volume":"68","author":[{"family":"Béres","given":"Szabolcs"},{"family":"Hejjel","given":"László"}],"issued":{"date-parts":[["2021",7]]}}}],"schema":"https://github.com/citation-style-language/schema/raw/master/csl-citation.json"} </w:instrText>
+      </w:r>
+      <w:r>
+        <w:fldChar w:fldCharType="separate"/>
+      </w:r>
+      <w:r>
+        <w:rPr>
+          <w:rFonts w:ascii="Aptos" w:hAnsi="Aptos"/>
+        </w:rPr>
+        <w:t>[38]</w:t>
+      </w:r>
+      <w:r>
+        <w:fldChar w:fldCharType="end"/>
+      </w:r>
+      <w:r>
+        <w:t xml:space="preserve">.  Window size determines how many pulses are available for each reported metric, and different metric types require different minimum windows. Heart rate itself, and most time-domain HRV parameters, can be reliably estimated from windows of about 10s [20]. Frequency-domain parameters, particularly LF power, need enough samples to capture several full oscillation cycles at low frequency and are only reliably estimated using windows of roughly 50s or longer [20]; using a shorter window for these parameters risks spectral leakage and an unstable LF/HF ratio. This window requirement consumes part of the 60s alert-latency budget established in the Requirements and specifications section, leaving the remaining time for classification and alert dispatch. To keep pace with continuous monitoring, the analysis window is advanced using a sliding, overlapping update (rather than being recomputed from scratch after every full window), so that metrics are refreshed more often than the window length itself. Windows containing motion-artefact-corrupted or missing samples are handled by rejecting the affected </w:t>
       </w:r>
       <w:r>
         <w:lastRenderedPageBreak/>
-        <w:t>including them has been shown to introduce significant error into ultra-short-term HRV estimates [33].</w:t>
+        <w:t>pulses at the peak-detection stage, since including them has been shown to introduce significant error into ultra-short-term HRV estimates [33].</w:t>
       </w:r>
     </w:p>
     <w:p>
@@ -6716,7 +6953,13 @@
         <w:t>Gini = 1 – Σ p_i²</w:t>
       </w:r>
       <w:r>
-        <w:t xml:space="preserve">  where p_i is the proportion of training samples at that node belonging to class i, and the sum is taken over all stress classes present (no stress, moderate stress, severe stress). A node containing only one class has a Gini impurity of 0, while a node with an even mix of classes has a higher impurity value. The algorithm selects, at each node, the split that minimises the weighted average Gini impurity of the resulting child nodes, and repeats this process recursively on each child until a stopping condition is reached (a maximum tree depth, a minimum number of samples remaining at a node, or a node containing only one class). This recursive splitting is what allows the tree to separate stress classes using combinations of HRV parameters rather than any single parameter alone.  Because classification only requires following a path from the root to a leaf, comparing one parameter against one threshold at each node, inference time scales with the depth of the tree rather than the size of the training set. This is what allows the classifier to run locally on a mobile device in real time, supporting the feasibility argument made earlier regarding computational cost.  The outputs of the two methods are combined conservatively: the alert subsystem is passed whichever of the two classifications is more severe, so that either a large sustained heart-rate deviation or a decision-tree-flagged stress state is sufficient to trigger the corresponding alert tier. This redundancy is intended to reduce the chance that a genuine dangerous state is missed because only one of the two methods detected it.</w:t>
+        <w:t xml:space="preserve">  where p_i is the proportion of training samples at that node belonging to class i, and the sum is taken over all stress classes present (no stress, moderate stress, severe stress). A node containing only one class has a Gini impurity of 0, while a node with an even mix of classes has a higher impurity value. The algorithm selects, at each node, the split that minimises the weighted average Gini impurity of the resulting child nodes, and repeats this process recursively on each child until a stopping condition is reached (a maximum tree depth, a minimum number of samples remaining at a node, or a node containing only one class). This recursive splitting is what allows the tree to separate stress classes using combinations of HRV parameters rather than any single parameter alone.  Because classification only requires following a path from the root to a leaf, comparing one parameter against one threshold at each node, inference time scales with the depth of the tree rather than the size of the training set. This is what allows the classifier to run locally on a mobile device in real time, supporting the feasibility argument made earlier regarding computational cost.  The outputs of the two methods are combined conservatively: the alert subsystem is passed whichever of the two classifications is more severe, so that either a </w:t>
+      </w:r>
+      <w:r>
+        <w:t>large, sustained</w:t>
+      </w:r>
+      <w:r>
+        <w:t xml:space="preserve"> heart-rate deviation or a decision-tree-flagged stress state is sufficient to trigger the corresponding alert tier. This redundancy is intended to reduce the chance that a genuine dangerous state is missed because only one of the two methods detected it.</w:t>
       </w:r>
     </w:p>
     <w:p>
@@ -6744,11 +6987,41 @@
     </w:p>
     <w:p>
       <w:r>
-        <w:t xml:space="preserve">Communication between the mobile application and the wearable haptic cuff is handled over a short-range wireless link, established once when the cuff is first paired with the user’s phone and maintained automatically thereafter. Bluetooth and Wi-Fi were both considered for this link. A Bluetooth-based link was selected because the cuff and phone are always within a few centimetres of one another on the same person, well within Bluetooth’s effective range, and Bluetooth’s characteristically lower power draw compared to Wi-Fi is preferable for a small, continuously-worn accessory [39]; Wi-Fi remains a viable alternative should a greater effective range between the cuff and phone ever be required, at the cost of higher power consumption on the cuff side. Once </w:t>
-      </w:r>
-      <w:r>
+        <w:rPr>
+          <w:highlight w:val="yellow"/>
+        </w:rPr>
+        <w:t xml:space="preserve">Communication between the mobile application and the wearable haptic cuff is handled over a short-range wireless link, established once when the cuff is first paired with the user’s phone and maintained automatically thereafter. Bluetooth and Wi-Fi </w:t>
+      </w:r>
+      <w:r>
+        <w:rPr>
+          <w:highlight w:val="yellow"/>
+        </w:rPr>
+        <w:t>are</w:t>
+      </w:r>
+      <w:r>
+        <w:rPr>
+          <w:highlight w:val="yellow"/>
+        </w:rPr>
+        <w:t xml:space="preserve"> consider</w:t>
+      </w:r>
+      <w:r>
+        <w:rPr>
+          <w:highlight w:val="yellow"/>
+        </w:rPr>
+        <w:t>ations</w:t>
+      </w:r>
+      <w:r>
+        <w:rPr>
+          <w:highlight w:val="yellow"/>
+        </w:rPr>
+        <w:t xml:space="preserve"> for this link. Once a severely or extremely stressed state is classified by the data analysis layer, the mobile application transmits a short alert-tier message over this link to the wearable microcontroller, which drives the vibration actuator on the cuff for the specified duration. For remote notifications, the same mobile application instead uses the phone’s existing cellular or Wi-Fi internet connection to reach the </w:t>
+      </w:r>
+      <w:r>
+        <w:rPr>
+          <w:highlight w:val="yellow"/>
+        </w:rPr>
         <w:lastRenderedPageBreak/>
-        <w:t>a moderately, severely or extremely stressed state is classified by the data analysis layer, the mobile application transmits a short alert-tier message over this link to the wearable microcontroller, which drives the vibration actuator on the cuff for the specified duration. For remote notifications, the same mobile application instead uses the phone’s existing cellular or Wi-Fi internet connection to reach the user’s pre-selected emergency contacts once an extreme stress state is detected, since this requires reaching contacts who are not necessarily nearby.</w:t>
+        <w:t>user’s pre-selected emergency contacts once an extreme stress state is detected, since this requires reaching contacts who are not necessarily nearby.</w:t>
       </w:r>
     </w:p>
     <w:p>
@@ -6763,7 +7036,28 @@
     </w:p>
     <w:p>
       <w:r>
-        <w:t>Two general categories of vibration actuator were considered for the cuff: eccentric rotating mass (ERM) motors, which spin an offset weight to produce vibration, and linear resonant actuators (LRA), which oscillate a mass along a single axis. An LRA-type actuator was favoured for this design, as this category of actuator starts and stops vibrating more quickly than ERM motors, which better suits the short, discrete 5–10 second alert pulses specified for this system, and this category is also generally more power-efficient at the vibration frequencies used for haptic alerting [40].</w:t>
+        <w:t xml:space="preserve">Two general categories of vibration actuator were considered for the cuff: eccentric rotating mass (ERM) motors, which spin an offset weight to produce vibration, and linear resonant actuators (LRA), which oscillate a mass along a single axis. An LRA-type actuator was favoured for this design, as this category of actuator starts and stops vibrating more quickly than ERM motors, which better suits the short, discrete 5–10 second alert pulses specified for this system, and this category is also generally more power-efficient at the vibration frequencies used for haptic alerting </w:t>
+      </w:r>
+      <w:r>
+        <w:fldChar w:fldCharType="begin"/>
+      </w:r>
+      <w:r>
+        <w:instrText xml:space="preserve"> ADDIN ZOTERO_ITEM CSL_CITATION {"citationID":"DMcmVcNn","properties":{"unsorted":false,"formattedCitation":"[39]","plainCitation":"[39]","noteIndex":0},"citationItems":[{"id":333,"uris":["http://zotero.org/users/19683069/items/2QKQQDI7"],"itemData":{"id":333,"type":"webpage","abstract":"New to haptics? We've put together this guide to help you understand the different types of vibration motors.","container-title":"TITAN Haptics","language":"en","title":"Haptic Technology 101: A Beginner's Guide to the Different Types of Vibration Motors","title-short":"Haptic Technology 101","URL":"https://titanhaptics.com/haptic-technology-101-a-beginners-guide-to-the-different-types-of-vibration-motors/","accessed":{"date-parts":[["2026",9,13]]},"issued":{"date-parts":[["2024",1,23]]}}}],"schema":"https://github.com/citation-style-language/schema/raw/master/csl-citation.json"} </w:instrText>
+      </w:r>
+      <w:r>
+        <w:fldChar w:fldCharType="separate"/>
+      </w:r>
+      <w:r>
+        <w:rPr>
+          <w:rFonts w:ascii="Aptos" w:hAnsi="Aptos"/>
+        </w:rPr>
+        <w:t>[39]</w:t>
+      </w:r>
+      <w:r>
+        <w:fldChar w:fldCharType="end"/>
+      </w:r>
+      <w:r>
+        <w:t>.</w:t>
       </w:r>
     </w:p>
     <w:p>
@@ -6793,11 +7087,11 @@
     </w:p>
     <w:p>
       <w:r>
-        <w:t>In addition to the heart-rate, HRV-based stress classification and alert-timing specifications listed above, the following metrics are used to evaluate the system: end-</w:t>
+        <w:t xml:space="preserve">In addition to the heart-rate, HRV-based stress classification and alert-timing specifications listed above, the following metrics are used to evaluate the system: end-to-end alert latency, defined as the time between a dangerous state being classified and a notification reaching the user or emergency contact, targeted at under 60s; signal-processing throughput, requiring the signal processing layer to output metrics at least as fast as raw PPG data is streamed in, so that no backlog accumulates during continuous monitoring; false-alert rate, the rate at which alerts are triggered with no </w:t>
       </w:r>
       <w:r>
         <w:lastRenderedPageBreak/>
-        <w:t>to-end alert latency, defined as the time between a dangerous state being classified and a notification reaching the user or emergency contact, targeted at under 60s; signal-processing throughput, requiring the signal processing layer to output metrics at least as fast as raw PPG data is streamed in, so that no backlog accumulates during continuous monitoring; false-alert rate, the rate at which alerts are triggered with no genuine dangerous physiological event present, which is to be minimised so that trust in the alerting subsystem is maintained; and wireless-link reliability, the proportion of alert-tier messages successfully delivered from the mobile application to the wearable cuff on the first attempt.</w:t>
+        <w:t>genuine dangerous physiological event present, which is to be minimised so that trust in the alerting subsystem is maintained; and wireless-link reliability, the proportion of alert-tier messages successfully delivered from the mobile application to the wearable cuff on the first attempt.</w:t>
       </w:r>
     </w:p>
     <w:p>
@@ -6888,7 +7182,6 @@
         </w:numPr>
       </w:pPr>
       <w:r>
-        <w:lastRenderedPageBreak/>
         <w:t>Overview of progress</w:t>
       </w:r>
       <w:bookmarkEnd w:id="38"/>
@@ -6902,6 +7195,7 @@
     <w:p>
       <w:bookmarkStart w:id="40" w:name="_Toc239699089"/>
       <w:r>
+        <w:lastRenderedPageBreak/>
         <w:t xml:space="preserve">The project is on track with 50% of all specifications being met. The mobile application successfully builds on an android device, pairs with a heart rate sensor and obtains data from it with accuracies and errors within acceptable tolerances. Further work is needed on the stress detection model’s implementation and, signal pre-processing and local notification/alert generation to achieve 75% of the project specs. To meet all project specs, future work should focus on implementing physical feedback to the alerts, remote notifications, implementing the app on devices running iOS and refining the analysis of data to cater to multiple age ranges, not to the averages currently used. </w:t>
       </w:r>
     </w:p>
@@ -7094,7 +7388,6 @@
         <w:pStyle w:val="Bibliography"/>
       </w:pPr>
       <w:r>
-        <w:lastRenderedPageBreak/>
         <w:t>[10]</w:t>
       </w:r>
       <w:r>
@@ -7149,6 +7442,7 @@
         <w:pStyle w:val="Bibliography"/>
       </w:pPr>
       <w:r>
+        <w:lastRenderedPageBreak/>
         <w:t>[12]</w:t>
       </w:r>
       <w:r>
@@ -7425,11 +7719,7 @@
       </w:r>
       <w:r>
         <w:tab/>
-        <w:t xml:space="preserve">R. Chen, “Wearable Medical Devices: Regulatory Pathway Guide (FDA, EU MDR 2026).” Accessed: Jul. 17, 2026. [Online]. Available: </w:t>
-      </w:r>
-      <w:r>
-        <w:lastRenderedPageBreak/>
-        <w:t>https://meddeviceguide.com/blog/wearable-medical-devices-regulatory-pathway-guide</w:t>
+        <w:t>R. Chen, “Wearable Medical Devices: Regulatory Pathway Guide (FDA, EU MDR 2026).” Accessed: Jul. 17, 2026. [Online]. Available: https://meddeviceguide.com/blog/wearable-medical-devices-regulatory-pathway-guide</w:t>
       </w:r>
     </w:p>
     <w:p>
@@ -7463,7 +7753,11 @@
       </w:r>
       <w:r>
         <w:tab/>
-        <w:t xml:space="preserve">M. Harford, J. Catherall, S. Gerry, J. Young, and P. Watkinson, “Availability and performance of image-based, non-contact methods of monitoring heart rate, blood pressure, respiratory rate, and oxygen saturation: a systematic review,” </w:t>
+        <w:t xml:space="preserve">M. Harford, J. Catherall, S. Gerry, J. Young, and P. Watkinson, “Availability and performance of image-based, non-contact methods of monitoring heart rate, blood </w:t>
+      </w:r>
+      <w:r>
+        <w:lastRenderedPageBreak/>
+        <w:t xml:space="preserve">pressure, respiratory rate, and oxygen saturation: a systematic review,” </w:t>
       </w:r>
       <w:r>
         <w:rPr>
@@ -7733,43 +8027,52 @@
         <w:pStyle w:val="Bibliography"/>
       </w:pPr>
       <w:r>
-        <w:t xml:space="preserve">[37] M. Elgendi, I. Norton, M. Brearley, D. Abbott, and D. Schuurmans, “Systolic Peak Detection in Acceleration Photoplethysmograms Measured from Emergency </w:t>
-      </w:r>
+        <w:t>[37]</w:t>
+      </w:r>
+      <w:r>
+        <w:tab/>
+        <w:t xml:space="preserve">M. Elgendi, I. Norton, M. Brearley, D. Abbott, and D. Schuurmans, “Systolic Peak Detection in Acceleration Photoplethysmograms Measured from Emergency Responders in Tropical Conditions,” </w:t>
+      </w:r>
+      <w:r>
+        <w:rPr>
+          <w:i/>
+          <w:iCs/>
+        </w:rPr>
+        <w:t>PLoS ONE</w:t>
+      </w:r>
+      <w:r>
+        <w:t>, vol. 8, no. 10, p. e76585, Oct. 2013, doi: 10.1371/journal.pone.0076585.</w:t>
+      </w:r>
+    </w:p>
+    <w:p>
+      <w:pPr>
+        <w:pStyle w:val="Bibliography"/>
+      </w:pPr>
+      <w:r>
+        <w:t>[38]</w:t>
+      </w:r>
+      <w:r>
+        <w:tab/>
+        <w:t xml:space="preserve">S. Béres and L. Hejjel, “The minimal sampling frequency of the photoplethysmogram for accurate pulse rate variability parameters in healthy volunteers,” </w:t>
+      </w:r>
+      <w:r>
+        <w:rPr>
+          <w:i/>
+          <w:iCs/>
+        </w:rPr>
+        <w:t>Biomedical Signal Processing and Control</w:t>
+      </w:r>
+      <w:r>
+        <w:t>, vol. 68, p. 102589, Jul. 2021, doi: 10.1016/j.bspc.2021.102589.</w:t>
+      </w:r>
+    </w:p>
+    <w:p>
+      <w:pPr>
+        <w:pStyle w:val="Bibliography"/>
+      </w:pPr>
       <w:r>
         <w:lastRenderedPageBreak/>
-        <w:t>Responders in Tropical Conditions,” PLoS ONE, vol. 8, no. 10, p. e76585, Oct. 2013, doi: 10.1371/journal.pone.0076585.</w:t>
-      </w:r>
-    </w:p>
-    <w:p>
-      <w:pPr>
-        <w:pStyle w:val="Bibliography"/>
-      </w:pPr>
-      <w:r>
-        <w:t>[38]</w:t>
-      </w:r>
-      <w:r>
-        <w:tab/>
-        <w:t>S. Béres and L. Hejjel, “The minimal sampling frequency of the photoplethysmogram for accurate pulse rate variability parameters in healthy volunteers,” Biomedical Signal Processing and Control, vol. 68, p. 102589, 2021, doi: 10.1016/j.bspc.2021.102589.</w:t>
-      </w:r>
-    </w:p>
-    <w:p>
-      <w:pPr>
-        <w:pStyle w:val="Bibliography"/>
-      </w:pPr>
-      <w:r>
         <w:t>[39]</w:t>
-      </w:r>
-      <w:r>
-        <w:tab/>
-        <w:t>D. Thomas, E. Wilkie, and J. Irvine, “Comparison of Power Consumption of WiFi Inbuilt Internet of Things Device with Bluetooth Low Energy,” World Academy of Science, Engineering and Technology, International Journal of Electronics and Communication Engineering, vol. 10, pp. 1856–1859, 2016.</w:t>
-      </w:r>
-    </w:p>
-    <w:p>
-      <w:pPr>
-        <w:pStyle w:val="Bibliography"/>
-      </w:pPr>
-      <w:r>
-        <w:t>[40]</w:t>
       </w:r>
       <w:r>
         <w:tab/>
@@ -7779,6 +8082,14 @@
     <w:p>
       <w:r>
         <w:fldChar w:fldCharType="end"/>
+      </w:r>
+    </w:p>
+    <w:p>
+      <w:pPr>
+        <w:pStyle w:val="Heading1"/>
+      </w:pPr>
+      <w:r>
+        <w:t>APPENDIX A</w:t>
       </w:r>
     </w:p>
     <w:sectPr>
@@ -9928,7 +10239,6 @@
   <w:style w:type="character" w:default="1" w:styleId="DefaultParagraphFont">
     <w:name w:val="Default Paragraph Font"/>
     <w:uiPriority w:val="1"/>
-    <w:semiHidden/>
     <w:unhideWhenUsed/>
   </w:style>
   <w:style w:type="table" w:default="1" w:styleId="TableNormal">

</xml_diff>